<commit_message>
background problem & model selection
</commit_message>
<xml_diff>
--- a/SWE Project.docx
+++ b/SWE Project.docx
@@ -727,6 +727,7 @@
           <w:docPartUnique/>
         </w:docPartObj>
       </w:sdtPr>
+      <w:sdtEndPr/>
       <w:sdtContent>
         <w:sdt>
           <w:sdtPr>
@@ -743,6 +744,7 @@
               <w:docPartUnique/>
             </w:docPartObj>
           </w:sdtPr>
+          <w:sdtEndPr/>
           <w:sdtContent>
             <w:p>
               <w:pPr>
@@ -1702,6 +1704,257 @@
         <w:t>--</w:t>
       </w:r>
     </w:p>
+    <w:p/>
+    <w:p/>
+    <w:p/>
+    <w:p/>
+    <w:p>
+      <w:pPr>
+        <w:rPr>
+          <w:b/>
+          <w:bCs/>
+        </w:rPr>
+      </w:pPr>
+      <w:r>
+        <w:lastRenderedPageBreak/>
+        <mc:AlternateContent>
+          <mc:Choice Requires="wps">
+            <w:drawing>
+              <wp:anchor distT="0" distB="0" distL="114300" distR="114300" simplePos="0" relativeHeight="251659264" behindDoc="0" locked="0" layoutInCell="1" allowOverlap="1" wp14:anchorId="0F83ADDA" wp14:editId="1F374856">
+                <wp:simplePos x="0" y="0"/>
+                <wp:positionH relativeFrom="column">
+                  <wp:posOffset>7987665</wp:posOffset>
+                </wp:positionH>
+                <wp:positionV relativeFrom="paragraph">
+                  <wp:posOffset>-5321300</wp:posOffset>
+                </wp:positionV>
+                <wp:extent cx="278765" cy="1927860"/>
+                <wp:effectExtent l="5715" t="12700" r="10795" b="12065"/>
+                <wp:wrapNone/>
+                <wp:docPr id="822048153" name="Rectangle 2"/>
+                <wp:cNvGraphicFramePr>
+                  <a:graphicFrameLocks xmlns:a="http://schemas.openxmlformats.org/drawingml/2006/main" noChangeAspect="1"/>
+                </wp:cNvGraphicFramePr>
+                <a:graphic xmlns:a="http://schemas.openxmlformats.org/drawingml/2006/main">
+                  <a:graphicData uri="http://schemas.microsoft.com/office/word/2010/wordprocessingShape">
+                    <wps:wsp>
+                      <wps:cNvSpPr>
+                        <a:spLocks noRot="1" noChangeAspect="1" noEditPoints="1" noChangeArrowheads="1" noChangeShapeType="1"/>
+                      </wps:cNvSpPr>
+                      <wps:spPr bwMode="auto">
+                        <a:xfrm>
+                          <a:off x="0" y="0"/>
+                          <a:ext cx="278765" cy="1927860"/>
+                        </a:xfrm>
+                        <a:prstGeom prst="rect">
+                          <a:avLst/>
+                        </a:prstGeom>
+                        <a:noFill/>
+                        <a:ln w="9000" cap="rnd" algn="ctr">
+                          <a:solidFill>
+                            <a:srgbClr val="000000"/>
+                          </a:solidFill>
+                          <a:miter lim="800000"/>
+                          <a:headEnd/>
+                          <a:tailEnd/>
+                        </a:ln>
+                        <a:extLst>
+                          <a:ext uri="{909E8E84-426E-40DD-AFC4-6F175D3DCCD1}">
+                            <a14:hiddenFill xmlns:a14="http://schemas.microsoft.com/office/drawing/2010/main">
+                              <a:noFill/>
+                            </a14:hiddenFill>
+                          </a:ext>
+                        </a:extLst>
+                      </wps:spPr>
+                      <wps:bodyPr rot="0" vert="horz" wrap="square" lIns="91440" tIns="45720" rIns="91440" bIns="45720" anchor="t" anchorCtr="0" upright="1">
+                        <a:noAutofit/>
+                      </wps:bodyPr>
+                    </wps:wsp>
+                  </a:graphicData>
+                </a:graphic>
+                <wp14:sizeRelH relativeFrom="page">
+                  <wp14:pctWidth>0</wp14:pctWidth>
+                </wp14:sizeRelH>
+                <wp14:sizeRelV relativeFrom="page">
+                  <wp14:pctHeight>0</wp14:pctHeight>
+                </wp14:sizeRelV>
+              </wp:anchor>
+            </w:drawing>
+          </mc:Choice>
+          <mc:Fallback>
+            <w:pict>
+              <v:rect w14:anchorId="31C8872E" id="Rectangle 2" o:spid="_x0000_s1026" style="position:absolute;margin-left:628.95pt;margin-top:-419pt;width:21.95pt;height:151.8pt;z-index:251659264;visibility:visible;mso-wrap-style:square;mso-width-percent:0;mso-height-percent:0;mso-wrap-distance-left:9pt;mso-wrap-distance-top:0;mso-wrap-distance-right:9pt;mso-wrap-distance-bottom:0;mso-position-horizontal:absolute;mso-position-horizontal-relative:text;mso-position-vertical:absolute;mso-position-vertical-relative:text;mso-width-percent:0;mso-height-percent:0;mso-width-relative:page;mso-height-relative:page;v-text-anchor:top" o:gfxdata="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" filled="f" strokeweight=".25mm">
+                <v:stroke endcap="round"/>
+                <o:lock v:ext="edit" rotation="t" aspectratio="t" verticies="t" shapetype="t"/>
+              </v:rect>
+            </w:pict>
+          </mc:Fallback>
+        </mc:AlternateContent>
+      </w:r>
+      <w:r>
+        <w:rPr>
+          <w:b/>
+          <w:bCs/>
+        </w:rPr>
+        <w:t>1. PROJECT PROPOSAL</w:t>
+      </w:r>
+    </w:p>
+    <w:p/>
+    <w:p>
+      <w:pPr>
+        <w:numPr>
+          <w:ilvl w:val="1"/>
+          <w:numId w:val="1"/>
+        </w:numPr>
+        <w:rPr>
+          <w:b/>
+          <w:bCs/>
+        </w:rPr>
+      </w:pPr>
+      <w:r>
+        <w:rPr>
+          <w:b/>
+          <w:bCs/>
+        </w:rPr>
+        <w:t>Background to the Problem</w:t>
+      </w:r>
+    </w:p>
+    <w:p>
+      <w:pPr>
+        <w:rPr>
+          <w:lang w:val="en-GB"/>
+        </w:rPr>
+      </w:pPr>
+      <w:r>
+        <w:rPr>
+          <w:lang w:val="en-GB"/>
+        </w:rPr>
+        <w:t xml:space="preserve">Modern </w:t>
+      </w:r>
+      <w:proofErr w:type="gramStart"/>
+      <w:r>
+        <w:rPr>
+          <w:lang w:val="en-GB"/>
+        </w:rPr>
+        <w:t>cafe’s</w:t>
+      </w:r>
+      <w:proofErr w:type="gramEnd"/>
+      <w:r>
+        <w:rPr>
+          <w:lang w:val="en-GB"/>
+        </w:rPr>
+        <w:t xml:space="preserve"> require fast, accurate, and organized service to handle daily operations such as taking orders, preparing food, managing bills, and maintaining records. Many small and medium cafes still depend on manual paper-based processes, which often lead to slow service, calculation errors, missing sales records, and difficulty in tracking inventory or staff activities. These issues reduce customer satisfaction and make business management harder for owners.</w:t>
+      </w:r>
+    </w:p>
+    <w:p>
+      <w:pPr>
+        <w:rPr>
+          <w:lang w:val="en-GB"/>
+        </w:rPr>
+      </w:pPr>
+      <w:r>
+        <w:rPr>
+          <w:lang w:val="en-GB"/>
+        </w:rPr>
+        <w:t xml:space="preserve">To solve these problems, a </w:t>
+      </w:r>
+      <w:r>
+        <w:rPr>
+          <w:b/>
+          <w:bCs/>
+          <w:lang w:val="en-GB"/>
+        </w:rPr>
+        <w:t>Cafe Management System</w:t>
+      </w:r>
+      <w:r>
+        <w:rPr>
+          <w:lang w:val="en-GB"/>
+        </w:rPr>
+        <w:t xml:space="preserve"> provides a digital platform where all core operations like order taking, billing, menu management, and user roles are managed in one place. This desktop-based application allows different types of users such as Admin, Staff, Cashier, and Customers to interact with the system according to their roles. The system helps automate repetitive tasks, ensures accuracy, speeds up customer service, and gives the owner full control and visibility over cafe operations.</w:t>
+      </w:r>
+    </w:p>
+    <w:p>
+      <w:pPr>
+        <w:rPr>
+          <w:lang w:val="en-GB"/>
+        </w:rPr>
+      </w:pPr>
+      <w:r>
+        <w:rPr>
+          <w:lang w:val="en-GB"/>
+        </w:rPr>
+        <w:t>This project aims to create a structured, user friendly, and efficient system that supports a cafe’s day-to-day workflow, minimizes human error, and improves overall business performance.</w:t>
+      </w:r>
+    </w:p>
+    <w:p>
+      <w:pPr>
+        <w:rPr>
+          <w:b/>
+          <w:bCs/>
+        </w:rPr>
+      </w:pPr>
+    </w:p>
+    <w:p>
+      <w:pPr>
+        <w:rPr>
+          <w:b/>
+          <w:bCs/>
+        </w:rPr>
+      </w:pPr>
+    </w:p>
+    <w:p>
+      <w:pPr>
+        <w:numPr>
+          <w:ilvl w:val="1"/>
+          <w:numId w:val="1"/>
+        </w:numPr>
+        <w:rPr>
+          <w:b/>
+          <w:bCs/>
+        </w:rPr>
+      </w:pPr>
+      <w:r>
+        <w:rPr>
+          <w:b/>
+          <w:bCs/>
+        </w:rPr>
+        <w:t>Selection of Process Model</w:t>
+      </w:r>
+    </w:p>
+    <w:p>
+      <w:r>
+        <w:t>For the development of the Cafe Management System, the Extreme Programming (XP) model has been selected. XP is an agile software development methodology that emphasizes high-quality code, continuous feedback, and adaptability to changing requirements, which are essential for this project.</w:t>
+      </w:r>
+    </w:p>
+    <w:p>
+      <w:r>
+        <w:t>Extreme Programming follows short development iterations, where the system is developed and improved incrementally. Frequent releases ensure that functional and testable components are delivered at regular intervals. This approach allows early detection of errors and ensures that the system continuously aligns with user requirements.</w:t>
+      </w:r>
+    </w:p>
+    <w:p>
+      <w:r>
+        <w:t xml:space="preserve">XP strongly focuses on customer involvement, where feedback is obtained frequently throughout the development process. This helps in refining features such as user management, donation handling, and administrative controls based on real needs. </w:t>
+      </w:r>
+      <w:r>
+        <w:lastRenderedPageBreak/>
+        <w:t>Practices like Test-Driven Development (TDD), pair programming, and continuous integration help maintain code reliability, reduce defects, and improve overall software quality.</w:t>
+      </w:r>
+    </w:p>
+    <w:p>
+      <w:r>
+        <w:t xml:space="preserve">For this project, development activities are organized into small iterations that include planning, coding, testing, and refactoring. This structured yet flexible approach reduces development risk, improves maintainability, and supports rapid changes. Therefore, the XP model </w:t>
+      </w:r>
+      <w:proofErr w:type="gramStart"/>
+      <w:r>
+        <w:t>is</w:t>
+      </w:r>
+      <w:proofErr w:type="gramEnd"/>
+      <w:r>
+        <w:t xml:space="preserve"> chosen as it provides an efficient and disciplined framework suitable for developing a reliable and scalable Cafe Management System.</w:t>
+      </w:r>
+    </w:p>
+    <w:p/>
+    <w:p/>
     <w:sectPr>
       <w:pgSz w:w="12240" w:h="15840"/>
       <w:pgMar w:top="1440" w:right="1440" w:bottom="1440" w:left="1440" w:header="720" w:footer="720" w:gutter="0"/>
@@ -1713,7 +1966,124 @@
 </file>
 
 <file path=word/numbering.xml><?xml version="1.0" encoding="utf-8"?>
-<w:numbering xmlns:wpc="http://schemas.microsoft.com/office/word/2010/wordprocessingCanvas" xmlns:cx="http://schemas.microsoft.com/office/drawing/2014/chartex" xmlns:cx1="http://schemas.microsoft.com/office/drawing/2015/9/8/chartex" xmlns:cx2="http://schemas.microsoft.com/office/drawing/2015/10/21/chartex" xmlns:cx3="http://schemas.microsoft.com/office/drawing/2016/5/9/chartex" xmlns:cx4="http://schemas.microsoft.com/office/drawing/2016/5/10/chartex" xmlns:cx5="http://schemas.microsoft.com/office/drawing/2016/5/11/chartex" xmlns:cx6="http://schemas.microsoft.com/office/drawing/2016/5/12/chartex" xmlns:cx7="http://schemas.microsoft.com/office/drawing/2016/5/13/chartex" xmlns:cx8="http://schemas.microsoft.com/office/drawing/2016/5/14/chartex" xmlns:mc="http://schemas.openxmlformats.org/markup-compatibility/2006" xmlns:aink="http://schemas.microsoft.com/office/drawing/2016/ink" xmlns:am3d="http://schemas.microsoft.com/office/drawing/2017/model3d" xmlns:o="urn:schemas-microsoft-com:office:office" xmlns:oel="http://schemas.microsoft.com/office/2019/extlst" xmlns:r="http://schemas.openxmlformats.org/officeDocument/2006/relationships" xmlns:m="http://schemas.openxmlformats.org/officeDocument/2006/math" xmlns:v="urn:schemas-microsoft-com:vml" xmlns:wp14="http://schemas.microsoft.com/office/word/2010/wordprocessingDrawing" xmlns:wp="http://schemas.openxmlformats.org/drawingml/2006/wordprocessingDrawing" xmlns:w10="urn:schemas-microsoft-com:office:word" xmlns:w="http://schemas.openxmlformats.org/wordprocessingml/2006/main" xmlns:w14="http://schemas.microsoft.com/office/word/2010/wordml" xmlns:w15="http://schemas.microsoft.com/office/word/2012/wordml" xmlns:w16cex="http://schemas.microsoft.com/office/word/2018/wordml/cex" xmlns:w16cid="http://schemas.microsoft.com/office/word/2016/wordml/cid" xmlns:w16="http://schemas.microsoft.com/office/word/2018/wordml" xmlns:w16du="http://schemas.microsoft.com/office/word/2023/wordml/word16du" xmlns:w16sdtdh="http://schemas.microsoft.com/office/word/2020/wordml/sdtdatahash" xmlns:w16sdtfl="http://schemas.microsoft.com/office/word/2024/wordml/sdtformatlock" xmlns:w16se="http://schemas.microsoft.com/office/word/2015/wordml/symex" xmlns:wpg="http://schemas.microsoft.com/office/word/2010/wordprocessingGroup" xmlns:wpi="http://schemas.microsoft.com/office/word/2010/wordprocessingInk" xmlns:wne="http://schemas.microsoft.com/office/word/2006/wordml" xmlns:wps="http://schemas.microsoft.com/office/word/2010/wordprocessingShape" mc:Ignorable="w14 w15 w16se w16cid w16 w16cex w16sdtdh w16sdtfl w16du wp14"/>
+<w:numbering xmlns:wpc="http://schemas.microsoft.com/office/word/2010/wordprocessingCanvas" xmlns:cx="http://schemas.microsoft.com/office/drawing/2014/chartex" xmlns:cx1="http://schemas.microsoft.com/office/drawing/2015/9/8/chartex" xmlns:cx2="http://schemas.microsoft.com/office/drawing/2015/10/21/chartex" xmlns:cx3="http://schemas.microsoft.com/office/drawing/2016/5/9/chartex" xmlns:cx4="http://schemas.microsoft.com/office/drawing/2016/5/10/chartex" xmlns:cx5="http://schemas.microsoft.com/office/drawing/2016/5/11/chartex" xmlns:cx6="http://schemas.microsoft.com/office/drawing/2016/5/12/chartex" xmlns:cx7="http://schemas.microsoft.com/office/drawing/2016/5/13/chartex" xmlns:cx8="http://schemas.microsoft.com/office/drawing/2016/5/14/chartex" xmlns:mc="http://schemas.openxmlformats.org/markup-compatibility/2006" xmlns:aink="http://schemas.microsoft.com/office/drawing/2016/ink" xmlns:am3d="http://schemas.microsoft.com/office/drawing/2017/model3d" xmlns:o="urn:schemas-microsoft-com:office:office" xmlns:oel="http://schemas.microsoft.com/office/2019/extlst" xmlns:r="http://schemas.openxmlformats.org/officeDocument/2006/relationships" xmlns:m="http://schemas.openxmlformats.org/officeDocument/2006/math" xmlns:v="urn:schemas-microsoft-com:vml" xmlns:wp14="http://schemas.microsoft.com/office/word/2010/wordprocessingDrawing" xmlns:wp="http://schemas.openxmlformats.org/drawingml/2006/wordprocessingDrawing" xmlns:w10="urn:schemas-microsoft-com:office:word" xmlns:w="http://schemas.openxmlformats.org/wordprocessingml/2006/main" xmlns:w14="http://schemas.microsoft.com/office/word/2010/wordml" xmlns:w15="http://schemas.microsoft.com/office/word/2012/wordml" xmlns:w16cex="http://schemas.microsoft.com/office/word/2018/wordml/cex" xmlns:w16cid="http://schemas.microsoft.com/office/word/2016/wordml/cid" xmlns:w16="http://schemas.microsoft.com/office/word/2018/wordml" xmlns:w16du="http://schemas.microsoft.com/office/word/2023/wordml/word16du" xmlns:w16sdtdh="http://schemas.microsoft.com/office/word/2020/wordml/sdtdatahash" xmlns:w16sdtfl="http://schemas.microsoft.com/office/word/2024/wordml/sdtformatlock" xmlns:w16se="http://schemas.microsoft.com/office/word/2015/wordml/symex" xmlns:wpg="http://schemas.microsoft.com/office/word/2010/wordprocessingGroup" xmlns:wpi="http://schemas.microsoft.com/office/word/2010/wordprocessingInk" xmlns:wne="http://schemas.microsoft.com/office/word/2006/wordml" xmlns:wps="http://schemas.microsoft.com/office/word/2010/wordprocessingShape" mc:Ignorable="w14 w15 w16se w16cid w16 w16cex w16sdtdh w16sdtfl w16du wp14">
+  <w:abstractNum w:abstractNumId="0" w15:restartNumberingAfterBreak="0">
+    <w:nsid w:val="55F60E61"/>
+    <w:multiLevelType w:val="multilevel"/>
+    <w:tmpl w:val="8976E178"/>
+    <w:lvl w:ilvl="0">
+      <w:start w:val="1"/>
+      <w:numFmt w:val="decimal"/>
+      <w:lvlText w:val="%1"/>
+      <w:lvlJc w:val="left"/>
+      <w:pPr>
+        <w:ind w:left="360" w:hanging="360"/>
+      </w:pPr>
+    </w:lvl>
+    <w:lvl w:ilvl="1">
+      <w:start w:val="1"/>
+      <w:numFmt w:val="decimal"/>
+      <w:lvlText w:val="%1.%2"/>
+      <w:lvlJc w:val="left"/>
+      <w:pPr>
+        <w:ind w:left="360" w:hanging="360"/>
+      </w:pPr>
+    </w:lvl>
+    <w:lvl w:ilvl="2">
+      <w:start w:val="1"/>
+      <w:numFmt w:val="decimal"/>
+      <w:lvlText w:val="%1.%2.%3"/>
+      <w:lvlJc w:val="left"/>
+      <w:pPr>
+        <w:ind w:left="720" w:hanging="720"/>
+      </w:pPr>
+    </w:lvl>
+    <w:lvl w:ilvl="3">
+      <w:start w:val="1"/>
+      <w:numFmt w:val="decimal"/>
+      <w:lvlText w:val="%1.%2.%3.%4"/>
+      <w:lvlJc w:val="left"/>
+      <w:pPr>
+        <w:ind w:left="720" w:hanging="720"/>
+      </w:pPr>
+    </w:lvl>
+    <w:lvl w:ilvl="4">
+      <w:start w:val="1"/>
+      <w:numFmt w:val="decimal"/>
+      <w:lvlText w:val="%1.%2.%3.%4.%5"/>
+      <w:lvlJc w:val="left"/>
+      <w:pPr>
+        <w:ind w:left="1080" w:hanging="1080"/>
+      </w:pPr>
+    </w:lvl>
+    <w:lvl w:ilvl="5">
+      <w:start w:val="1"/>
+      <w:numFmt w:val="decimal"/>
+      <w:lvlText w:val="%1.%2.%3.%4.%5.%6"/>
+      <w:lvlJc w:val="left"/>
+      <w:pPr>
+        <w:ind w:left="1080" w:hanging="1080"/>
+      </w:pPr>
+    </w:lvl>
+    <w:lvl w:ilvl="6">
+      <w:start w:val="1"/>
+      <w:numFmt w:val="decimal"/>
+      <w:lvlText w:val="%1.%2.%3.%4.%5.%6.%7"/>
+      <w:lvlJc w:val="left"/>
+      <w:pPr>
+        <w:ind w:left="1440" w:hanging="1440"/>
+      </w:pPr>
+    </w:lvl>
+    <w:lvl w:ilvl="7">
+      <w:start w:val="1"/>
+      <w:numFmt w:val="decimal"/>
+      <w:lvlText w:val="%1.%2.%3.%4.%5.%6.%7.%8"/>
+      <w:lvlJc w:val="left"/>
+      <w:pPr>
+        <w:ind w:left="1440" w:hanging="1440"/>
+      </w:pPr>
+    </w:lvl>
+    <w:lvl w:ilvl="8">
+      <w:start w:val="1"/>
+      <w:numFmt w:val="decimal"/>
+      <w:lvlText w:val="%1.%2.%3.%4.%5.%6.%7.%8.%9"/>
+      <w:lvlJc w:val="left"/>
+      <w:pPr>
+        <w:ind w:left="1440" w:hanging="1440"/>
+      </w:pPr>
+    </w:lvl>
+  </w:abstractNum>
+  <w:num w:numId="1" w16cid:durableId="79954453">
+    <w:abstractNumId w:val="0"/>
+    <w:lvlOverride w:ilvl="0">
+      <w:startOverride w:val="1"/>
+    </w:lvlOverride>
+    <w:lvlOverride w:ilvl="1">
+      <w:startOverride w:val="1"/>
+    </w:lvlOverride>
+    <w:lvlOverride w:ilvl="2">
+      <w:startOverride w:val="1"/>
+    </w:lvlOverride>
+    <w:lvlOverride w:ilvl="3">
+      <w:startOverride w:val="1"/>
+    </w:lvlOverride>
+    <w:lvlOverride w:ilvl="4">
+      <w:startOverride w:val="1"/>
+    </w:lvlOverride>
+    <w:lvlOverride w:ilvl="5">
+      <w:startOverride w:val="1"/>
+    </w:lvlOverride>
+    <w:lvlOverride w:ilvl="6">
+      <w:startOverride w:val="1"/>
+    </w:lvlOverride>
+    <w:lvlOverride w:ilvl="7">
+      <w:startOverride w:val="1"/>
+    </w:lvlOverride>
+    <w:lvlOverride w:ilvl="8">
+      <w:startOverride w:val="1"/>
+    </w:lvlOverride>
+  </w:num>
+</w:numbering>
 </file>
 
 <file path=word/styles.xml><?xml version="1.0" encoding="utf-8"?>

</xml_diff>